<commit_message>
cap nhat tai lieu tieng Viet co dau dung chinh ta va bo sung dong code
</commit_message>
<xml_diff>
--- a/HoSoBenhAn.docx
+++ b/HoSoBenhAn.docx
@@ -18,7 +18,7 @@
           <w:b/>
           <w:sz w:val="32"/>
         </w:rPr>
-        <w:t>TAI LIEU PHAN TICH MA NGUON PHAN HE: HO SO BENH AN &amp; LICH SU KHAM</w:t>
+        <w:t>TÀI LIỆU PHÂN TÍCH MÃ NGUỒN PHÂN HỆ: HỒ SƠ BỆNH ÁN &amp; LỊCH SỬ KHÁM</w:t>
       </w:r>
     </w:p>
     <w:p>
@@ -35,7 +35,7 @@
           <w:rFonts w:ascii="Times New Roman" w:hAnsi="Times New Roman" w:cs="Times New Roman"/>
           <w:sz w:val="26"/>
         </w:rPr>
-        <w:t>Tai lieu nay mo ta nghiep vu, co so du lieu SQL Server, ma nguon Backend (C# ASP.NET Core) va ma nguon Frontend (ReactJS) cua phan he Tra cuu Ho so benh an.</w:t>
+        <w:t>Tài liệu này mô tả chi tiết nghiệp vụ, cấu trúc cơ sở dữ liệu SQL Server, mã nguồn Backend (C# ASP.NET Core) và mã nguồn Frontend (ReactJS) của phân hệ Tra cứu Hồ sơ bệnh án &amp; Lịch sử khám của bệnh nhân.</w:t>
       </w:r>
     </w:p>
     <w:p>
@@ -53,7 +53,7 @@
           <w:b/>
           <w:sz w:val="28"/>
         </w:rPr>
-        <w:t>1. MIEU TA NGHIEP VU CHUC NANG</w:t>
+        <w:t>1. MIÊU TẢ NGHIỆP VỤ CHỨC NĂNG</w:t>
       </w:r>
     </w:p>
     <w:p>
@@ -70,7 +70,7 @@
           <w:rFonts w:ascii="Times New Roman" w:hAnsi="Times New Roman" w:cs="Times New Roman"/>
           <w:sz w:val="26"/>
         </w:rPr>
-        <w:t>Phan he Ho so benh an ho tro nhan vien y te va bac si nhanh chong:</w:t>
+        <w:t>Phân hệ Hồ sơ bệnh án hỗ trợ nhân viên y tế và bác sĩ nhanh chóng tra cứu thông tin điều trị cũ của bệnh nhân:</w:t>
       </w:r>
     </w:p>
     <w:p>
@@ -87,22 +87,22 @@
           <w:rFonts w:ascii="Times New Roman" w:hAnsi="Times New Roman" w:cs="Times New Roman"/>
           <w:sz w:val="26"/>
         </w:rPr>
-        <w:t xml:space="preserve">   *   </w:t>
-      </w:r>
-      <w:r>
-        <w:rPr>
-          <w:rFonts w:ascii="Times New Roman" w:hAnsi="Times New Roman" w:cs="Times New Roman"/>
-          <w:b/>
-          <w:sz w:val="26"/>
-        </w:rPr>
-        <w:t xml:space="preserve">Tra cuu da dang: </w:t>
-      </w:r>
-      <w:r>
-        <w:rPr>
-          <w:rFonts w:ascii="Times New Roman" w:hAnsi="Times New Roman" w:cs="Times New Roman"/>
-          <w:sz w:val="26"/>
-        </w:rPr>
-        <w:t>Tim kiem benh nhan thong qua Ma benh nhan, So dien thoai, Ho ten (ho tro tim kiem tuong doi chua tu khoa) hoac Ma phieu kham.</w:t>
+        <w:t xml:space="preserve">   â€¢   </w:t>
+      </w:r>
+      <w:r>
+        <w:rPr>
+          <w:rFonts w:ascii="Times New Roman" w:hAnsi="Times New Roman" w:cs="Times New Roman"/>
+          <w:b/>
+          <w:sz w:val="26"/>
+        </w:rPr>
+        <w:t xml:space="preserve">Tra cứu đa tiêu chí: </w:t>
+      </w:r>
+      <w:r>
+        <w:rPr>
+          <w:rFonts w:ascii="Times New Roman" w:hAnsi="Times New Roman" w:cs="Times New Roman"/>
+          <w:sz w:val="26"/>
+        </w:rPr>
+        <w:t>Tìm kiếm bệnh nhân thông qua Mã bệnh nhân, Số điện thoại, Họ tên (hỗ trợ tìm kiếm gần đúng chứa từ khóa) hoặc Mã phiếu khám.</w:t>
       </w:r>
     </w:p>
     <w:p>
@@ -119,22 +119,22 @@
           <w:rFonts w:ascii="Times New Roman" w:hAnsi="Times New Roman" w:cs="Times New Roman"/>
           <w:sz w:val="26"/>
         </w:rPr>
-        <w:t xml:space="preserve">   *   </w:t>
-      </w:r>
-      <w:r>
-        <w:rPr>
-          <w:rFonts w:ascii="Times New Roman" w:hAnsi="Times New Roman" w:cs="Times New Roman"/>
-          <w:b/>
-          <w:sz w:val="26"/>
-        </w:rPr>
-        <w:t xml:space="preserve">Hien thi thong tin hanh chinh: </w:t>
-      </w:r>
-      <w:r>
-        <w:rPr>
-          <w:rFonts w:ascii="Times New Roman" w:hAnsi="Times New Roman" w:cs="Times New Roman"/>
-          <w:sz w:val="26"/>
-        </w:rPr>
-        <w:t>Xem cac thong tin hanh chinh nhu Ho ten, Ngay sinh, Gioi tinh, Dia chi, va Tien su benh ly gia dinh/ca nhan.</w:t>
+        <w:t xml:space="preserve">   â€¢   </w:t>
+      </w:r>
+      <w:r>
+        <w:rPr>
+          <w:rFonts w:ascii="Times New Roman" w:hAnsi="Times New Roman" w:cs="Times New Roman"/>
+          <w:b/>
+          <w:sz w:val="26"/>
+        </w:rPr>
+        <w:t xml:space="preserve">Thông tin hành chính bệnh nhân: </w:t>
+      </w:r>
+      <w:r>
+        <w:rPr>
+          <w:rFonts w:ascii="Times New Roman" w:hAnsi="Times New Roman" w:cs="Times New Roman"/>
+          <w:sz w:val="26"/>
+        </w:rPr>
+        <w:t>Hiển thị đầy đủ thông tin hành chính như Họ tên, Ngày sinh, Giới tính, Số điện thoại, Địa chỉ, và Tiền sử bệnh lý gia đình/ca nhân để phục vụ bác sĩ nắm bắt tình trạng tổng quát.</w:t>
       </w:r>
     </w:p>
     <w:p>
@@ -151,22 +151,22 @@
           <w:rFonts w:ascii="Times New Roman" w:hAnsi="Times New Roman" w:cs="Times New Roman"/>
           <w:sz w:val="26"/>
         </w:rPr>
-        <w:t xml:space="preserve">   *   </w:t>
-      </w:r>
-      <w:r>
-        <w:rPr>
-          <w:rFonts w:ascii="Times New Roman" w:hAnsi="Times New Roman" w:cs="Times New Roman"/>
-          <w:b/>
-          <w:sz w:val="26"/>
-        </w:rPr>
-        <w:t xml:space="preserve">Lich su cac lan kham: </w:t>
-      </w:r>
-      <w:r>
-        <w:rPr>
-          <w:rFonts w:ascii="Times New Roman" w:hAnsi="Times New Roman" w:cs="Times New Roman"/>
-          <w:sz w:val="26"/>
-        </w:rPr>
-        <w:t>Hien thi danh sach tat ca cac luot kham benh truoc day, thong tin Bac si dieu tri, Ket luan chan doan va cac ma ICD-10 cua tung luot.</w:t>
+        <w:t xml:space="preserve">   â€¢   </w:t>
+      </w:r>
+      <w:r>
+        <w:rPr>
+          <w:rFonts w:ascii="Times New Roman" w:hAnsi="Times New Roman" w:cs="Times New Roman"/>
+          <w:b/>
+          <w:sz w:val="26"/>
+        </w:rPr>
+        <w:t xml:space="preserve">Lịch sử chi tiết các lượt khám: </w:t>
+      </w:r>
+      <w:r>
+        <w:rPr>
+          <w:rFonts w:ascii="Times New Roman" w:hAnsi="Times New Roman" w:cs="Times New Roman"/>
+          <w:sz w:val="26"/>
+        </w:rPr>
+        <w:t>Hiển thị danh sách tất cả các lượt khám trước đây của bệnh nhân, thông tin Bác sĩ phụ trách lượt khám, Kết luận chẩn đoán lâm sàng và danh sách các mã ICD-10 liên quan của lượt khám đó.</w:t>
       </w:r>
     </w:p>
     <w:p>
@@ -183,22 +183,22 @@
           <w:rFonts w:ascii="Times New Roman" w:hAnsi="Times New Roman" w:cs="Times New Roman"/>
           <w:sz w:val="26"/>
         </w:rPr>
-        <w:t xml:space="preserve">   *   </w:t>
-      </w:r>
-      <w:r>
-        <w:rPr>
-          <w:rFonts w:ascii="Times New Roman" w:hAnsi="Times New Roman" w:cs="Times New Roman"/>
-          <w:b/>
-          <w:sz w:val="26"/>
-        </w:rPr>
-        <w:t xml:space="preserve">Bong bong chon nhanh: </w:t>
-      </w:r>
-      <w:r>
-        <w:rPr>
-          <w:rFonts w:ascii="Times New Roman" w:hAnsi="Times New Roman" w:cs="Times New Roman"/>
-          <w:sz w:val="26"/>
-        </w:rPr>
-        <w:t>Hien thi 5 benh nhan duoc kham gan day nhat de nhan click chon nhanh ma khong can nhap o tim kiem.</w:t>
+        <w:t xml:space="preserve">   â€¢   </w:t>
+      </w:r>
+      <w:r>
+        <w:rPr>
+          <w:rFonts w:ascii="Times New Roman" w:hAnsi="Times New Roman" w:cs="Times New Roman"/>
+          <w:b/>
+          <w:sz w:val="26"/>
+        </w:rPr>
+        <w:t xml:space="preserve">Lối tắt chọn nhanh: </w:t>
+      </w:r>
+      <w:r>
+        <w:rPr>
+          <w:rFonts w:ascii="Times New Roman" w:hAnsi="Times New Roman" w:cs="Times New Roman"/>
+          <w:sz w:val="26"/>
+        </w:rPr>
+        <w:t>Hiển thị danh sách 5 bệnh nhân vừa tiếp nhận hoặc khám gần đây nhất để bác sĩ có thể click chọn nhanh mà không cần gõ ô tìm kiếm.</w:t>
       </w:r>
     </w:p>
     <w:p>
@@ -216,7 +216,7 @@
           <w:b/>
           <w:sz w:val="28"/>
         </w:rPr>
-        <w:t>2. THIET KE CO SO DU LIEU (SQL SERVER)</w:t>
+        <w:t>2. THIẾT KẾ CƠ SỞ DỮ LIỆU (SQL SERVER)</w:t>
       </w:r>
     </w:p>
     <w:p>
@@ -233,7 +233,7 @@
           <w:rFonts w:ascii="Times New Roman" w:hAnsi="Times New Roman" w:cs="Times New Roman"/>
           <w:sz w:val="26"/>
         </w:rPr>
-        <w:t>Du lieu cua phan he duoc khai thac tu he thong co so du lieu lien ket:</w:t>
+        <w:t>Dữ liệu lịch sử bệnh án được tổng hợp từ các mối liên kết bảng:</w:t>
       </w:r>
     </w:p>
     <w:p>
@@ -250,22 +250,22 @@
           <w:rFonts w:ascii="Times New Roman" w:hAnsi="Times New Roman" w:cs="Times New Roman"/>
           <w:sz w:val="26"/>
         </w:rPr>
-        <w:t xml:space="preserve">   *   </w:t>
-      </w:r>
-      <w:r>
-        <w:rPr>
-          <w:rFonts w:ascii="Times New Roman" w:hAnsi="Times New Roman" w:cs="Times New Roman"/>
-          <w:b/>
-          <w:sz w:val="26"/>
-        </w:rPr>
-        <w:t xml:space="preserve">BenhNhan: </w:t>
-      </w:r>
-      <w:r>
-        <w:rPr>
-          <w:rFonts w:ascii="Times New Roman" w:hAnsi="Times New Roman" w:cs="Times New Roman"/>
-          <w:sz w:val="26"/>
-        </w:rPr>
-        <w:t>Luu thong tin hanh chinh goc cua benh nhan (MaBN, HoTen, NgaySinh, GioiTinh, Sdt, DiaChi, TienSuBenh).</w:t>
+        <w:t xml:space="preserve">   â€¢   </w:t>
+      </w:r>
+      <w:r>
+        <w:rPr>
+          <w:rFonts w:ascii="Times New Roman" w:hAnsi="Times New Roman" w:cs="Times New Roman"/>
+          <w:b/>
+          <w:sz w:val="26"/>
+        </w:rPr>
+        <w:t xml:space="preserve">Bảng BenhNhan: </w:t>
+      </w:r>
+      <w:r>
+        <w:rPr>
+          <w:rFonts w:ascii="Times New Roman" w:hAnsi="Times New Roman" w:cs="Times New Roman"/>
+          <w:sz w:val="26"/>
+        </w:rPr>
+        <w:t>Lưu thông tin hành chính gốc của bệnh nhân (MaBN, HoTen, NgaySinh, GioiTinh, Sdt, DiaChi, TienSuBenh).</w:t>
       </w:r>
     </w:p>
     <w:p>
@@ -282,22 +282,22 @@
           <w:rFonts w:ascii="Times New Roman" w:hAnsi="Times New Roman" w:cs="Times New Roman"/>
           <w:sz w:val="26"/>
         </w:rPr>
-        <w:t xml:space="preserve">   *   </w:t>
-      </w:r>
-      <w:r>
-        <w:rPr>
-          <w:rFonts w:ascii="Times New Roman" w:hAnsi="Times New Roman" w:cs="Times New Roman"/>
-          <w:b/>
-          <w:sz w:val="26"/>
-        </w:rPr>
-        <w:t xml:space="preserve">PhieuKham: </w:t>
-      </w:r>
-      <w:r>
-        <w:rPr>
-          <w:rFonts w:ascii="Times New Roman" w:hAnsi="Times New Roman" w:cs="Times New Roman"/>
-          <w:sz w:val="26"/>
-        </w:rPr>
-        <w:t>Luu tru tung luot kham cua benh nhan (MaPhieu, MaBN, NgayKham, KetLuan, MaNV).</w:t>
+        <w:t xml:space="preserve">   â€¢   </w:t>
+      </w:r>
+      <w:r>
+        <w:rPr>
+          <w:rFonts w:ascii="Times New Roman" w:hAnsi="Times New Roman" w:cs="Times New Roman"/>
+          <w:b/>
+          <w:sz w:val="26"/>
+        </w:rPr>
+        <w:t xml:space="preserve">Bảng PhieuKham: </w:t>
+      </w:r>
+      <w:r>
+        <w:rPr>
+          <w:rFonts w:ascii="Times New Roman" w:hAnsi="Times New Roman" w:cs="Times New Roman"/>
+          <w:sz w:val="26"/>
+        </w:rPr>
+        <w:t>Lưu trữ thông tin của từng lượt khám của bệnh nhân (MaPhieu, MaBN, NgayKham, KetLuan, MaNV).</w:t>
       </w:r>
     </w:p>
     <w:p>
@@ -314,22 +314,22 @@
           <w:rFonts w:ascii="Times New Roman" w:hAnsi="Times New Roman" w:cs="Times New Roman"/>
           <w:sz w:val="26"/>
         </w:rPr>
-        <w:t xml:space="preserve">   *   </w:t>
-      </w:r>
-      <w:r>
-        <w:rPr>
-          <w:rFonts w:ascii="Times New Roman" w:hAnsi="Times New Roman" w:cs="Times New Roman"/>
-          <w:b/>
-          <w:sz w:val="26"/>
-        </w:rPr>
-        <w:t xml:space="preserve">NhanVien: </w:t>
-      </w:r>
-      <w:r>
-        <w:rPr>
-          <w:rFonts w:ascii="Times New Roman" w:hAnsi="Times New Roman" w:cs="Times New Roman"/>
-          <w:sz w:val="26"/>
-        </w:rPr>
-        <w:t>Lien ket qua PhieuKham.MaNV de lay ten bac si phá»¥ trÃ¡ch luot kham do.</w:t>
+        <w:t xml:space="preserve">   â€¢   </w:t>
+      </w:r>
+      <w:r>
+        <w:rPr>
+          <w:rFonts w:ascii="Times New Roman" w:hAnsi="Times New Roman" w:cs="Times New Roman"/>
+          <w:b/>
+          <w:sz w:val="26"/>
+        </w:rPr>
+        <w:t xml:space="preserve">Bảng NhanVien: </w:t>
+      </w:r>
+      <w:r>
+        <w:rPr>
+          <w:rFonts w:ascii="Times New Roman" w:hAnsi="Times New Roman" w:cs="Times New Roman"/>
+          <w:sz w:val="26"/>
+        </w:rPr>
+        <w:t>Liên kết qua PhieuKham.MaNV để lấy họ tên bác sĩ phụ trách lượt khám đó.</w:t>
       </w:r>
     </w:p>
     <w:p>
@@ -346,22 +346,22 @@
           <w:rFonts w:ascii="Times New Roman" w:hAnsi="Times New Roman" w:cs="Times New Roman"/>
           <w:sz w:val="26"/>
         </w:rPr>
-        <w:t xml:space="preserve">   *   </w:t>
-      </w:r>
-      <w:r>
-        <w:rPr>
-          <w:rFonts w:ascii="Times New Roman" w:hAnsi="Times New Roman" w:cs="Times New Roman"/>
-          <w:b/>
-          <w:sz w:val="26"/>
-        </w:rPr>
-        <w:t xml:space="preserve">ChiTietPhieuKhamICD &amp; DanhMucICD: </w:t>
-      </w:r>
-      <w:r>
-        <w:rPr>
-          <w:rFonts w:ascii="Times New Roman" w:hAnsi="Times New Roman" w:cs="Times New Roman"/>
-          <w:sz w:val="26"/>
-        </w:rPr>
-        <w:t>Duyet cac ma benh ly va ten benh tuong ung da duoc chan doan.</w:t>
+        <w:t xml:space="preserve">   â€¢   </w:t>
+      </w:r>
+      <w:r>
+        <w:rPr>
+          <w:rFonts w:ascii="Times New Roman" w:hAnsi="Times New Roman" w:cs="Times New Roman"/>
+          <w:b/>
+          <w:sz w:val="26"/>
+        </w:rPr>
+        <w:t xml:space="preserve">Bảng ChiTietPhieuKhamICD &amp; DanhMucICD: </w:t>
+      </w:r>
+      <w:r>
+        <w:rPr>
+          <w:rFonts w:ascii="Times New Roman" w:hAnsi="Times New Roman" w:cs="Times New Roman"/>
+          <w:sz w:val="26"/>
+        </w:rPr>
+        <w:t>Lấy ra các mã bệnh lý và mô tả chẩn đoán kèm theo của lượt khám.</w:t>
       </w:r>
     </w:p>
     <w:p>
@@ -379,7 +379,7 @@
           <w:b/>
           <w:sz w:val="28"/>
         </w:rPr>
-        <w:t>3. PHAN TICH MA NGUON BACKEND (C# ASP.NET CORE)</w:t>
+        <w:t>3. PHÂN TÍCH MÃ NGUỒN BACKEND (C# ASP.NET CORE)</w:t>
       </w:r>
     </w:p>
     <w:p>
@@ -396,247 +396,407 @@
           <w:rFonts w:ascii="Times New Roman" w:hAnsi="Times New Roman" w:cs="Times New Roman"/>
           <w:sz w:val="26"/>
         </w:rPr>
-        <w:t>Dinh nghia trong HoSoBenhAnController.cs bao gom ba endpoint chinh:</w:t>
-      </w:r>
-    </w:p>
-    <w:p>
-      <w:pPr>
-        <w:spacing w:after="80"/>
-        <w:jc w:val="both"/>
-        <w:rPr>
-          <w:rFonts w:ascii="Times New Roman" w:hAnsi="Times New Roman" w:cs="Times New Roman"/>
-          <w:sz w:val="26"/>
-        </w:rPr>
-      </w:pPr>
-      <w:r>
-        <w:rPr>
-          <w:rFonts w:ascii="Times New Roman" w:hAnsi="Times New Roman" w:cs="Times New Roman"/>
-          <w:sz w:val="26"/>
-        </w:rPr>
-        <w:t xml:space="preserve">   *   </w:t>
-      </w:r>
-      <w:r>
-        <w:rPr>
-          <w:rFonts w:ascii="Times New Roman" w:hAnsi="Times New Roman" w:cs="Times New Roman"/>
-          <w:b/>
-          <w:sz w:val="26"/>
-        </w:rPr>
-        <w:t xml:space="preserve">GET api/HoSoBenhAn/tra-cuu: </w:t>
-      </w:r>
-      <w:r>
-        <w:rPr>
-          <w:rFonts w:ascii="Times New Roman" w:hAnsi="Times New Roman" w:cs="Times New Roman"/>
-          <w:sz w:val="26"/>
-        </w:rPr>
-        <w:t>Thuc hien tim kiem gan dung theo tu khoa va tra ve thong tin hanh chinh benh nhan.</w:t>
-      </w:r>
-    </w:p>
-    <w:p>
-      <w:pPr>
-        <w:spacing w:after="80"/>
-        <w:jc w:val="both"/>
-        <w:rPr>
-          <w:rFonts w:ascii="Times New Roman" w:hAnsi="Times New Roman" w:cs="Times New Roman"/>
-          <w:sz w:val="26"/>
-        </w:rPr>
-      </w:pPr>
-      <w:r>
-        <w:rPr>
-          <w:rFonts w:ascii="Times New Roman" w:hAnsi="Times New Roman" w:cs="Times New Roman"/>
-          <w:sz w:val="26"/>
-        </w:rPr>
-        <w:t xml:space="preserve">   *   </w:t>
-      </w:r>
-      <w:r>
-        <w:rPr>
-          <w:rFonts w:ascii="Times New Roman" w:hAnsi="Times New Roman" w:cs="Times New Roman"/>
-          <w:b/>
-          <w:sz w:val="26"/>
-        </w:rPr>
-        <w:t xml:space="preserve">GET api/HoSoBenhAn/gan-day: </w:t>
-      </w:r>
-      <w:r>
-        <w:rPr>
-          <w:rFonts w:ascii="Times New Roman" w:hAnsi="Times New Roman" w:cs="Times New Roman"/>
-          <w:sz w:val="26"/>
-        </w:rPr>
-        <w:t>Group by MaBn tren bang PhieuKham, sap xep theo thoi gian gan nhat de lay ra 5 benh nhan.</w:t>
-      </w:r>
-    </w:p>
-    <w:p>
-      <w:pPr>
-        <w:spacing w:after="80"/>
-        <w:jc w:val="both"/>
-        <w:rPr>
-          <w:rFonts w:ascii="Times New Roman" w:hAnsi="Times New Roman" w:cs="Times New Roman"/>
-          <w:sz w:val="26"/>
-        </w:rPr>
-      </w:pPr>
-      <w:r>
-        <w:rPr>
-          <w:rFonts w:ascii="Times New Roman" w:hAnsi="Times New Roman" w:cs="Times New Roman"/>
-          <w:sz w:val="26"/>
-        </w:rPr>
-        <w:t xml:space="preserve">   *   </w:t>
-      </w:r>
-      <w:r>
-        <w:rPr>
-          <w:rFonts w:ascii="Times New Roman" w:hAnsi="Times New Roman" w:cs="Times New Roman"/>
-          <w:b/>
-          <w:sz w:val="26"/>
-        </w:rPr>
-        <w:t xml:space="preserve">GET api/HoSoBenhAn/{maBN}/lich-su: </w:t>
-      </w:r>
-      <w:r>
-        <w:rPr>
-          <w:rFonts w:ascii="Times New Roman" w:hAnsi="Times New Roman" w:cs="Times New Roman"/>
-          <w:sz w:val="26"/>
-        </w:rPr>
-        <w:t>Lay toan bo danh sach cac phieu kham da tung thuc hien cua benh nhan sap xep giam dan theo thoi gian.</w:t>
-      </w:r>
-    </w:p>
-    <w:p>
-      <w:pPr>
-        <w:spacing w:after="80" w:line="240" w:lineRule="auto"/>
-        <w:rPr>
-          <w:rFonts w:ascii="Courier New" w:hAnsi="Courier New" w:cs="Courier New"/>
-          <w:sz w:val="20"/>
-        </w:rPr>
-      </w:pPr>
-      <w:r>
-        <w:rPr>
-          <w:rFonts w:ascii="Courier New" w:hAnsi="Courier New" w:cs="Courier New"/>
-          <w:sz w:val="20"/>
-        </w:rPr>
-        <w:t>[HttpGet("{maBN}/lich-su")]</w:t>
-      </w:r>
-    </w:p>
-    <w:p>
-      <w:pPr>
-        <w:spacing w:after="80" w:line="240" w:lineRule="auto"/>
-        <w:rPr>
-          <w:rFonts w:ascii="Courier New" w:hAnsi="Courier New" w:cs="Courier New"/>
-          <w:sz w:val="20"/>
-        </w:rPr>
-      </w:pPr>
-      <w:r>
-        <w:rPr>
-          <w:rFonts w:ascii="Courier New" w:hAnsi="Courier New" w:cs="Courier New"/>
-          <w:sz w:val="20"/>
-        </w:rPr>
-        <w:t>[Authorize(Roles = "BacSi,Admin")]</w:t>
-      </w:r>
-    </w:p>
-    <w:p>
-      <w:pPr>
-        <w:spacing w:after="80" w:line="240" w:lineRule="auto"/>
-        <w:rPr>
-          <w:rFonts w:ascii="Courier New" w:hAnsi="Courier New" w:cs="Courier New"/>
-          <w:sz w:val="20"/>
-        </w:rPr>
-      </w:pPr>
-      <w:r>
-        <w:rPr>
-          <w:rFonts w:ascii="Courier New" w:hAnsi="Courier New" w:cs="Courier New"/>
-          <w:sz w:val="20"/>
-        </w:rPr>
-        <w:t>public async Task&lt;IActionResult&gt; LayLichSuKhamBenh(string maBN)</w:t>
-      </w:r>
-    </w:p>
-    <w:p>
-      <w:pPr>
-        <w:spacing w:after="80" w:line="240" w:lineRule="auto"/>
-        <w:rPr>
-          <w:rFonts w:ascii="Courier New" w:hAnsi="Courier New" w:cs="Courier New"/>
-          <w:sz w:val="20"/>
-        </w:rPr>
-      </w:pPr>
-      <w:r>
-        <w:rPr>
-          <w:rFonts w:ascii="Courier New" w:hAnsi="Courier New" w:cs="Courier New"/>
-          <w:sz w:val="20"/>
-        </w:rPr>
-        <w:t>{</w:t>
-      </w:r>
-    </w:p>
-    <w:p>
-      <w:pPr>
-        <w:spacing w:after="80" w:line="240" w:lineRule="auto"/>
-        <w:rPr>
-          <w:rFonts w:ascii="Courier New" w:hAnsi="Courier New" w:cs="Courier New"/>
-          <w:sz w:val="20"/>
-        </w:rPr>
-      </w:pPr>
-      <w:r>
-        <w:rPr>
-          <w:rFonts w:ascii="Courier New" w:hAnsi="Courier New" w:cs="Courier New"/>
-          <w:sz w:val="20"/>
-        </w:rPr>
-        <w:t xml:space="preserve">    // 1. Kiem tra maBN hop le va ton tai trong DB</w:t>
-      </w:r>
-    </w:p>
-    <w:p>
-      <w:pPr>
-        <w:spacing w:after="80" w:line="240" w:lineRule="auto"/>
-        <w:rPr>
-          <w:rFonts w:ascii="Courier New" w:hAnsi="Courier New" w:cs="Courier New"/>
-          <w:sz w:val="20"/>
-        </w:rPr>
-      </w:pPr>
-      <w:r>
-        <w:rPr>
-          <w:rFonts w:ascii="Courier New" w:hAnsi="Courier New" w:cs="Courier New"/>
-          <w:sz w:val="20"/>
-        </w:rPr>
-        <w:t xml:space="preserve">    // 2. Query PhieuKham, Include thong tin NhanVien va DanhMucICD</w:t>
-      </w:r>
-    </w:p>
-    <w:p>
-      <w:pPr>
-        <w:spacing w:after="80" w:line="240" w:lineRule="auto"/>
-        <w:rPr>
-          <w:rFonts w:ascii="Courier New" w:hAnsi="Courier New" w:cs="Courier New"/>
-          <w:sz w:val="20"/>
-        </w:rPr>
-      </w:pPr>
-      <w:r>
-        <w:rPr>
-          <w:rFonts w:ascii="Courier New" w:hAnsi="Courier New" w:cs="Courier New"/>
-          <w:sz w:val="20"/>
-        </w:rPr>
-        <w:t xml:space="preserve">    // 3. Select lay ra maPhieu, ngayKham, tenBacSi, ketLuan, danh sach ICD</w:t>
-      </w:r>
-    </w:p>
-    <w:p>
-      <w:pPr>
-        <w:spacing w:after="80" w:line="240" w:lineRule="auto"/>
-        <w:rPr>
-          <w:rFonts w:ascii="Courier New" w:hAnsi="Courier New" w:cs="Courier New"/>
-          <w:sz w:val="20"/>
-        </w:rPr>
-      </w:pPr>
-      <w:r>
-        <w:rPr>
-          <w:rFonts w:ascii="Courier New" w:hAnsi="Courier New" w:cs="Courier New"/>
-          <w:sz w:val="20"/>
-        </w:rPr>
-        <w:t xml:space="preserve">    // 4. Tra ve HTTP 200 kem du lieu JSON</w:t>
-      </w:r>
-    </w:p>
-    <w:p>
-      <w:pPr>
-        <w:spacing w:after="80" w:line="240" w:lineRule="auto"/>
-        <w:rPr>
-          <w:rFonts w:ascii="Courier New" w:hAnsi="Courier New" w:cs="Courier New"/>
-          <w:sz w:val="20"/>
-        </w:rPr>
-      </w:pPr>
-      <w:r>
-        <w:rPr>
-          <w:rFonts w:ascii="Courier New" w:hAnsi="Courier New" w:cs="Courier New"/>
-          <w:sz w:val="20"/>
-        </w:rPr>
-        <w:t>}</w:t>
+        <w:t>Các Endpoint chính trong HoSoBenhAnController.cs thực thi việc tra cứu và lấy lịch sử:</w:t>
+      </w:r>
+    </w:p>
+    <w:p>
+      <w:pPr>
+        <w:spacing w:before="80" w:after="80" w:line="240" w:lineRule="auto"/>
+        <w:rPr>
+          <w:rFonts w:ascii="Courier New" w:hAnsi="Courier New" w:cs="Courier New"/>
+          <w:sz w:val="19"/>
+        </w:rPr>
+      </w:pPr>
+      <w:r>
+        <w:rPr>
+          <w:rFonts w:ascii="Courier New" w:hAnsi="Courier New" w:cs="Courier New"/>
+          <w:sz w:val="19"/>
+        </w:rPr>
+        <w:t xml:space="preserve">    [HttpGet("{maBN}/lich-su")]</w:t>
+      </w:r>
+    </w:p>
+    <w:p>
+      <w:pPr>
+        <w:spacing w:before="80" w:after="80" w:line="240" w:lineRule="auto"/>
+        <w:rPr>
+          <w:rFonts w:ascii="Courier New" w:hAnsi="Courier New" w:cs="Courier New"/>
+          <w:sz w:val="19"/>
+        </w:rPr>
+      </w:pPr>
+      <w:r>
+        <w:rPr>
+          <w:rFonts w:ascii="Courier New" w:hAnsi="Courier New" w:cs="Courier New"/>
+          <w:sz w:val="19"/>
+        </w:rPr>
+        <w:t xml:space="preserve">    [Authorize(Roles = "BacSi,Admin")]</w:t>
+      </w:r>
+    </w:p>
+    <w:p>
+      <w:pPr>
+        <w:spacing w:before="80" w:after="80" w:line="240" w:lineRule="auto"/>
+        <w:rPr>
+          <w:rFonts w:ascii="Courier New" w:hAnsi="Courier New" w:cs="Courier New"/>
+          <w:sz w:val="19"/>
+        </w:rPr>
+      </w:pPr>
+      <w:r>
+        <w:rPr>
+          <w:rFonts w:ascii="Courier New" w:hAnsi="Courier New" w:cs="Courier New"/>
+          <w:sz w:val="19"/>
+        </w:rPr>
+        <w:t xml:space="preserve">    public async Task&lt;IActionResult&gt; LayLichSuKhamBenh(string maBN)</w:t>
+      </w:r>
+    </w:p>
+    <w:p>
+      <w:pPr>
+        <w:spacing w:before="80" w:after="80" w:line="240" w:lineRule="auto"/>
+        <w:rPr>
+          <w:rFonts w:ascii="Courier New" w:hAnsi="Courier New" w:cs="Courier New"/>
+          <w:sz w:val="19"/>
+        </w:rPr>
+      </w:pPr>
+      <w:r>
+        <w:rPr>
+          <w:rFonts w:ascii="Courier New" w:hAnsi="Courier New" w:cs="Courier New"/>
+          <w:sz w:val="19"/>
+        </w:rPr>
+        <w:t xml:space="preserve">    {</w:t>
+      </w:r>
+    </w:p>
+    <w:p>
+      <w:pPr>
+        <w:spacing w:before="80" w:after="80" w:line="240" w:lineRule="auto"/>
+        <w:rPr>
+          <w:rFonts w:ascii="Courier New" w:hAnsi="Courier New" w:cs="Courier New"/>
+          <w:sz w:val="19"/>
+        </w:rPr>
+      </w:pPr>
+      <w:r>
+        <w:rPr>
+          <w:rFonts w:ascii="Courier New" w:hAnsi="Courier New" w:cs="Courier New"/>
+          <w:sz w:val="19"/>
+        </w:rPr>
+        <w:t xml:space="preserve">        var lichSu = await _context.PhieuKhams</w:t>
+      </w:r>
+    </w:p>
+    <w:p>
+      <w:pPr>
+        <w:spacing w:before="80" w:after="80" w:line="240" w:lineRule="auto"/>
+        <w:rPr>
+          <w:rFonts w:ascii="Courier New" w:hAnsi="Courier New" w:cs="Courier New"/>
+          <w:sz w:val="19"/>
+        </w:rPr>
+      </w:pPr>
+      <w:r>
+        <w:rPr>
+          <w:rFonts w:ascii="Courier New" w:hAnsi="Courier New" w:cs="Courier New"/>
+          <w:sz w:val="19"/>
+        </w:rPr>
+        <w:t xml:space="preserve">            .Include(p =&gt; p.MaNvNavigation) // JOIN bảng Nhân viên để lấy tên bác sĩ</w:t>
+      </w:r>
+    </w:p>
+    <w:p>
+      <w:pPr>
+        <w:spacing w:before="80" w:after="80" w:line="240" w:lineRule="auto"/>
+        <w:rPr>
+          <w:rFonts w:ascii="Courier New" w:hAnsi="Courier New" w:cs="Courier New"/>
+          <w:sz w:val="19"/>
+        </w:rPr>
+      </w:pPr>
+      <w:r>
+        <w:rPr>
+          <w:rFonts w:ascii="Courier New" w:hAnsi="Courier New" w:cs="Courier New"/>
+          <w:sz w:val="19"/>
+        </w:rPr>
+        <w:t xml:space="preserve">            .Include(p =&gt; p.ChiTietPhieuKhamIcds)</w:t>
+      </w:r>
+    </w:p>
+    <w:p>
+      <w:pPr>
+        <w:spacing w:before="80" w:after="80" w:line="240" w:lineRule="auto"/>
+        <w:rPr>
+          <w:rFonts w:ascii="Courier New" w:hAnsi="Courier New" w:cs="Courier New"/>
+          <w:sz w:val="19"/>
+        </w:rPr>
+      </w:pPr>
+      <w:r>
+        <w:rPr>
+          <w:rFonts w:ascii="Courier New" w:hAnsi="Courier New" w:cs="Courier New"/>
+          <w:sz w:val="19"/>
+        </w:rPr>
+        <w:t xml:space="preserve">                .ThenInclude(i =&gt; i.MaIcdNavigation) // JOIN bảng danh mục ICD</w:t>
+      </w:r>
+    </w:p>
+    <w:p>
+      <w:pPr>
+        <w:spacing w:before="80" w:after="80" w:line="240" w:lineRule="auto"/>
+        <w:rPr>
+          <w:rFonts w:ascii="Courier New" w:hAnsi="Courier New" w:cs="Courier New"/>
+          <w:sz w:val="19"/>
+        </w:rPr>
+      </w:pPr>
+      <w:r>
+        <w:rPr>
+          <w:rFonts w:ascii="Courier New" w:hAnsi="Courier New" w:cs="Courier New"/>
+          <w:sz w:val="19"/>
+        </w:rPr>
+        <w:t xml:space="preserve">            .Where(p =&gt; p.MaBn == maBN &amp;&amp; p.TrangThaiKham == 3) // Chỉ lấy các phiếu đã khám xong</w:t>
+      </w:r>
+    </w:p>
+    <w:p>
+      <w:pPr>
+        <w:spacing w:before="80" w:after="80" w:line="240" w:lineRule="auto"/>
+        <w:rPr>
+          <w:rFonts w:ascii="Courier New" w:hAnsi="Courier New" w:cs="Courier New"/>
+          <w:sz w:val="19"/>
+        </w:rPr>
+      </w:pPr>
+      <w:r>
+        <w:rPr>
+          <w:rFonts w:ascii="Courier New" w:hAnsi="Courier New" w:cs="Courier New"/>
+          <w:sz w:val="19"/>
+        </w:rPr>
+        <w:t xml:space="preserve">            .OrderByDescending(p =&gt; p.NgayKham)</w:t>
+      </w:r>
+    </w:p>
+    <w:p>
+      <w:pPr>
+        <w:spacing w:before="80" w:after="80" w:line="240" w:lineRule="auto"/>
+        <w:rPr>
+          <w:rFonts w:ascii="Courier New" w:hAnsi="Courier New" w:cs="Courier New"/>
+          <w:sz w:val="19"/>
+        </w:rPr>
+      </w:pPr>
+      <w:r>
+        <w:rPr>
+          <w:rFonts w:ascii="Courier New" w:hAnsi="Courier New" w:cs="Courier New"/>
+          <w:sz w:val="19"/>
+        </w:rPr>
+        <w:t xml:space="preserve">            .AsNoTracking() // Tắt tracking thực thể để tối ưu hiệu năng đọc</w:t>
+      </w:r>
+    </w:p>
+    <w:p>
+      <w:pPr>
+        <w:spacing w:before="80" w:after="80" w:line="240" w:lineRule="auto"/>
+        <w:rPr>
+          <w:rFonts w:ascii="Courier New" w:hAnsi="Courier New" w:cs="Courier New"/>
+          <w:sz w:val="19"/>
+        </w:rPr>
+      </w:pPr>
+      <w:r>
+        <w:rPr>
+          <w:rFonts w:ascii="Courier New" w:hAnsi="Courier New" w:cs="Courier New"/>
+          <w:sz w:val="19"/>
+        </w:rPr>
+        <w:t xml:space="preserve">            .Select(p =&gt; new {</w:t>
+      </w:r>
+    </w:p>
+    <w:p>
+      <w:pPr>
+        <w:spacing w:before="80" w:after="80" w:line="240" w:lineRule="auto"/>
+        <w:rPr>
+          <w:rFonts w:ascii="Courier New" w:hAnsi="Courier New" w:cs="Courier New"/>
+          <w:sz w:val="19"/>
+        </w:rPr>
+      </w:pPr>
+      <w:r>
+        <w:rPr>
+          <w:rFonts w:ascii="Courier New" w:hAnsi="Courier New" w:cs="Courier New"/>
+          <w:sz w:val="19"/>
+        </w:rPr>
+        <w:t xml:space="preserve">                maPhieu = p.MaPhieu,</w:t>
+      </w:r>
+    </w:p>
+    <w:p>
+      <w:pPr>
+        <w:spacing w:before="80" w:after="80" w:line="240" w:lineRule="auto"/>
+        <w:rPr>
+          <w:rFonts w:ascii="Courier New" w:hAnsi="Courier New" w:cs="Courier New"/>
+          <w:sz w:val="19"/>
+        </w:rPr>
+      </w:pPr>
+      <w:r>
+        <w:rPr>
+          <w:rFonts w:ascii="Courier New" w:hAnsi="Courier New" w:cs="Courier New"/>
+          <w:sz w:val="19"/>
+        </w:rPr>
+        <w:t xml:space="preserve">                ngayKham = p.NgayKham,</w:t>
+      </w:r>
+    </w:p>
+    <w:p>
+      <w:pPr>
+        <w:spacing w:before="80" w:after="80" w:line="240" w:lineRule="auto"/>
+        <w:rPr>
+          <w:rFonts w:ascii="Courier New" w:hAnsi="Courier New" w:cs="Courier New"/>
+          <w:sz w:val="19"/>
+        </w:rPr>
+      </w:pPr>
+      <w:r>
+        <w:rPr>
+          <w:rFonts w:ascii="Courier New" w:hAnsi="Courier New" w:cs="Courier New"/>
+          <w:sz w:val="19"/>
+        </w:rPr>
+        <w:t xml:space="preserve">                tenBacSi = p.MaNvNavigation.HoTen,</w:t>
+      </w:r>
+    </w:p>
+    <w:p>
+      <w:pPr>
+        <w:spacing w:before="80" w:after="80" w:line="240" w:lineRule="auto"/>
+        <w:rPr>
+          <w:rFonts w:ascii="Courier New" w:hAnsi="Courier New" w:cs="Courier New"/>
+          <w:sz w:val="19"/>
+        </w:rPr>
+      </w:pPr>
+      <w:r>
+        <w:rPr>
+          <w:rFonts w:ascii="Courier New" w:hAnsi="Courier New" w:cs="Courier New"/>
+          <w:sz w:val="19"/>
+        </w:rPr>
+        <w:t xml:space="preserve">                ketLuan = p.KetLuan,</w:t>
+      </w:r>
+    </w:p>
+    <w:p>
+      <w:pPr>
+        <w:spacing w:before="80" w:after="80" w:line="240" w:lineRule="auto"/>
+        <w:rPr>
+          <w:rFonts w:ascii="Courier New" w:hAnsi="Courier New" w:cs="Courier New"/>
+          <w:sz w:val="19"/>
+        </w:rPr>
+      </w:pPr>
+      <w:r>
+        <w:rPr>
+          <w:rFonts w:ascii="Courier New" w:hAnsi="Courier New" w:cs="Courier New"/>
+          <w:sz w:val="19"/>
+        </w:rPr>
+        <w:t xml:space="preserve">                icdList = p.ChiTietPhieuKhamIcds.Select(i =&gt; new {</w:t>
+      </w:r>
+    </w:p>
+    <w:p>
+      <w:pPr>
+        <w:spacing w:before="80" w:after="80" w:line="240" w:lineRule="auto"/>
+        <w:rPr>
+          <w:rFonts w:ascii="Courier New" w:hAnsi="Courier New" w:cs="Courier New"/>
+          <w:sz w:val="19"/>
+        </w:rPr>
+      </w:pPr>
+      <w:r>
+        <w:rPr>
+          <w:rFonts w:ascii="Courier New" w:hAnsi="Courier New" w:cs="Courier New"/>
+          <w:sz w:val="19"/>
+        </w:rPr>
+        <w:t xml:space="preserve">                    maICD = i.MaIcd,</w:t>
+      </w:r>
+    </w:p>
+    <w:p>
+      <w:pPr>
+        <w:spacing w:before="80" w:after="80" w:line="240" w:lineRule="auto"/>
+        <w:rPr>
+          <w:rFonts w:ascii="Courier New" w:hAnsi="Courier New" w:cs="Courier New"/>
+          <w:sz w:val="19"/>
+        </w:rPr>
+      </w:pPr>
+      <w:r>
+        <w:rPr>
+          <w:rFonts w:ascii="Courier New" w:hAnsi="Courier New" w:cs="Courier New"/>
+          <w:sz w:val="19"/>
+        </w:rPr>
+        <w:t xml:space="preserve">                    tenBenh = i.MaIcdNavigation.TenBenh</w:t>
+      </w:r>
+    </w:p>
+    <w:p>
+      <w:pPr>
+        <w:spacing w:before="80" w:after="80" w:line="240" w:lineRule="auto"/>
+        <w:rPr>
+          <w:rFonts w:ascii="Courier New" w:hAnsi="Courier New" w:cs="Courier New"/>
+          <w:sz w:val="19"/>
+        </w:rPr>
+      </w:pPr>
+      <w:r>
+        <w:rPr>
+          <w:rFonts w:ascii="Courier New" w:hAnsi="Courier New" w:cs="Courier New"/>
+          <w:sz w:val="19"/>
+        </w:rPr>
+        <w:t xml:space="preserve">                }).ToList()</w:t>
+      </w:r>
+    </w:p>
+    <w:p>
+      <w:pPr>
+        <w:spacing w:before="80" w:after="80" w:line="240" w:lineRule="auto"/>
+        <w:rPr>
+          <w:rFonts w:ascii="Courier New" w:hAnsi="Courier New" w:cs="Courier New"/>
+          <w:sz w:val="19"/>
+        </w:rPr>
+      </w:pPr>
+      <w:r>
+        <w:rPr>
+          <w:rFonts w:ascii="Courier New" w:hAnsi="Courier New" w:cs="Courier New"/>
+          <w:sz w:val="19"/>
+        </w:rPr>
+        <w:t xml:space="preserve">            })</w:t>
+      </w:r>
+    </w:p>
+    <w:p>
+      <w:pPr>
+        <w:spacing w:before="80" w:after="80" w:line="240" w:lineRule="auto"/>
+        <w:rPr>
+          <w:rFonts w:ascii="Courier New" w:hAnsi="Courier New" w:cs="Courier New"/>
+          <w:sz w:val="19"/>
+        </w:rPr>
+      </w:pPr>
+      <w:r>
+        <w:rPr>
+          <w:rFonts w:ascii="Courier New" w:hAnsi="Courier New" w:cs="Courier New"/>
+          <w:sz w:val="19"/>
+        </w:rPr>
+        <w:t xml:space="preserve">            .ToListAsync();</w:t>
+      </w:r>
+    </w:p>
+    <w:p>
+      <w:pPr>
+        <w:spacing w:before="80" w:after="80" w:line="240" w:lineRule="auto"/>
+        <w:rPr>
+          <w:rFonts w:ascii="Courier New" w:hAnsi="Courier New" w:cs="Courier New"/>
+          <w:sz w:val="19"/>
+        </w:rPr>
+      </w:pPr>
+      <w:r>
+        <w:rPr>
+          <w:rFonts w:ascii="Courier New" w:hAnsi="Courier New" w:cs="Courier New"/>
+          <w:sz w:val="19"/>
+        </w:rPr>
+        <w:t xml:space="preserve">        </w:t>
+      </w:r>
+    </w:p>
+    <w:p>
+      <w:pPr>
+        <w:spacing w:before="80" w:after="80" w:line="240" w:lineRule="auto"/>
+        <w:rPr>
+          <w:rFonts w:ascii="Courier New" w:hAnsi="Courier New" w:cs="Courier New"/>
+          <w:sz w:val="19"/>
+        </w:rPr>
+      </w:pPr>
+      <w:r>
+        <w:rPr>
+          <w:rFonts w:ascii="Courier New" w:hAnsi="Courier New" w:cs="Courier New"/>
+          <w:sz w:val="19"/>
+        </w:rPr>
+        <w:t xml:space="preserve">        return Ok(new { data = lichSu });</w:t>
+      </w:r>
+    </w:p>
+    <w:p>
+      <w:pPr>
+        <w:spacing w:before="80" w:after="80" w:line="240" w:lineRule="auto"/>
+        <w:rPr>
+          <w:rFonts w:ascii="Courier New" w:hAnsi="Courier New" w:cs="Courier New"/>
+          <w:sz w:val="19"/>
+        </w:rPr>
+      </w:pPr>
+      <w:r>
+        <w:rPr>
+          <w:rFonts w:ascii="Courier New" w:hAnsi="Courier New" w:cs="Courier New"/>
+          <w:sz w:val="19"/>
+        </w:rPr>
+        <w:t xml:space="preserve">    }</w:t>
       </w:r>
     </w:p>
     <w:p>
@@ -654,7 +814,7 @@
           <w:b/>
           <w:sz w:val="28"/>
         </w:rPr>
-        <w:t>4. PHAN TICH MA NGUON FRONTEND (REACTJS &amp; TAILWIND CSS)</w:t>
+        <w:t>4. PHÂN TÍCH MÃ NGUỒN FRONTEND (REACTJS &amp; TAILWIND CSS)</w:t>
       </w:r>
     </w:p>
     <w:p>
@@ -672,7 +832,7 @@
           <w:b/>
           <w:sz w:val="26"/>
         </w:rPr>
-        <w:t>4.1. Cac ham goi API trong api.js</w:t>
+        <w:t>4.1. Các hàm gọi API trong file utils/api.js</w:t>
       </w:r>
     </w:p>
     <w:p>
@@ -689,55 +849,151 @@
           <w:rFonts w:ascii="Times New Roman" w:hAnsi="Times New Roman" w:cs="Times New Roman"/>
           <w:sz w:val="26"/>
         </w:rPr>
-        <w:t>Frontend ket noi voi backend qua ba API thiet ke rieng:</w:t>
-      </w:r>
-    </w:p>
-    <w:p>
-      <w:pPr>
-        <w:spacing w:after="80" w:line="240" w:lineRule="auto"/>
-        <w:rPr>
-          <w:rFonts w:ascii="Courier New" w:hAnsi="Courier New" w:cs="Courier New"/>
-          <w:sz w:val="20"/>
-        </w:rPr>
-      </w:pPr>
-      <w:r>
-        <w:rPr>
-          <w:rFonts w:ascii="Courier New" w:hAnsi="Courier New" w:cs="Courier New"/>
-          <w:sz w:val="20"/>
-        </w:rPr>
-        <w:t>export const apiTraCuuHoSoBenhAn = async (query) =&gt; { ... };</w:t>
-      </w:r>
-    </w:p>
-    <w:p>
-      <w:pPr>
-        <w:spacing w:after="80" w:line="240" w:lineRule="auto"/>
-        <w:rPr>
-          <w:rFonts w:ascii="Courier New" w:hAnsi="Courier New" w:cs="Courier New"/>
-          <w:sz w:val="20"/>
-        </w:rPr>
-      </w:pPr>
-      <w:r>
-        <w:rPr>
-          <w:rFonts w:ascii="Courier New" w:hAnsi="Courier New" w:cs="Courier New"/>
-          <w:sz w:val="20"/>
-        </w:rPr>
-        <w:t>export const apiGetBenhNhanGanDay = async () =&gt; { ... };</w:t>
-      </w:r>
-    </w:p>
-    <w:p>
-      <w:pPr>
-        <w:spacing w:after="80" w:line="240" w:lineRule="auto"/>
-        <w:rPr>
-          <w:rFonts w:ascii="Courier New" w:hAnsi="Courier New" w:cs="Courier New"/>
-          <w:sz w:val="20"/>
-        </w:rPr>
-      </w:pPr>
-      <w:r>
-        <w:rPr>
-          <w:rFonts w:ascii="Courier New" w:hAnsi="Courier New" w:cs="Courier New"/>
-          <w:sz w:val="20"/>
-        </w:rPr>
-        <w:t>export const apiGetLichSuKhamBenh = async (maBN) =&gt; { ... };</w:t>
+        <w:t>Frontend thực hiện gọi API trực tiếp để lấy dữ liệu thay vì load từ LocalStorage:</w:t>
+      </w:r>
+    </w:p>
+    <w:p>
+      <w:pPr>
+        <w:spacing w:before="80" w:after="80" w:line="240" w:lineRule="auto"/>
+        <w:rPr>
+          <w:rFonts w:ascii="Courier New" w:hAnsi="Courier New" w:cs="Courier New"/>
+          <w:sz w:val="19"/>
+        </w:rPr>
+      </w:pPr>
+      <w:r>
+        <w:rPr>
+          <w:rFonts w:ascii="Courier New" w:hAnsi="Courier New" w:cs="Courier New"/>
+          <w:sz w:val="19"/>
+        </w:rPr>
+        <w:t>export const apiTraCuuHoSoBenhAn = async (query) =&gt; {</w:t>
+      </w:r>
+    </w:p>
+    <w:p>
+      <w:pPr>
+        <w:spacing w:before="80" w:after="80" w:line="240" w:lineRule="auto"/>
+        <w:rPr>
+          <w:rFonts w:ascii="Courier New" w:hAnsi="Courier New" w:cs="Courier New"/>
+          <w:sz w:val="19"/>
+        </w:rPr>
+      </w:pPr>
+      <w:r>
+        <w:rPr>
+          <w:rFonts w:ascii="Courier New" w:hAnsi="Courier New" w:cs="Courier New"/>
+          <w:sz w:val="19"/>
+        </w:rPr>
+        <w:t xml:space="preserve">  return await apiFetch(`/HoSoBenhAn/tra-cuu?query=${encodeURIComponent(query)}`);</w:t>
+      </w:r>
+    </w:p>
+    <w:p>
+      <w:pPr>
+        <w:spacing w:before="80" w:after="80" w:line="240" w:lineRule="auto"/>
+        <w:rPr>
+          <w:rFonts w:ascii="Courier New" w:hAnsi="Courier New" w:cs="Courier New"/>
+          <w:sz w:val="19"/>
+        </w:rPr>
+      </w:pPr>
+      <w:r>
+        <w:rPr>
+          <w:rFonts w:ascii="Courier New" w:hAnsi="Courier New" w:cs="Courier New"/>
+          <w:sz w:val="19"/>
+        </w:rPr>
+        <w:t>};</w:t>
+      </w:r>
+    </w:p>
+    <w:p>
+      <w:pPr>
+        <w:spacing w:before="80" w:after="80" w:line="240" w:lineRule="auto"/>
+        <w:rPr>
+          <w:rFonts w:ascii="Courier New" w:hAnsi="Courier New" w:cs="Courier New"/>
+          <w:sz w:val="19"/>
+        </w:rPr>
+      </w:pPr>
+      <w:r>
+        <w:rPr>
+          <w:rFonts w:ascii="Courier New" w:hAnsi="Courier New" w:cs="Courier New"/>
+          <w:sz w:val="19"/>
+        </w:rPr>
+        <w:t>export const apiGetBenhNhanGanDay = async () =&gt; {</w:t>
+      </w:r>
+    </w:p>
+    <w:p>
+      <w:pPr>
+        <w:spacing w:before="80" w:after="80" w:line="240" w:lineRule="auto"/>
+        <w:rPr>
+          <w:rFonts w:ascii="Courier New" w:hAnsi="Courier New" w:cs="Courier New"/>
+          <w:sz w:val="19"/>
+        </w:rPr>
+      </w:pPr>
+      <w:r>
+        <w:rPr>
+          <w:rFonts w:ascii="Courier New" w:hAnsi="Courier New" w:cs="Courier New"/>
+          <w:sz w:val="19"/>
+        </w:rPr>
+        <w:t xml:space="preserve">  return await apiFetch(`/HoSoBenhAn/gan-day`);</w:t>
+      </w:r>
+    </w:p>
+    <w:p>
+      <w:pPr>
+        <w:spacing w:before="80" w:after="80" w:line="240" w:lineRule="auto"/>
+        <w:rPr>
+          <w:rFonts w:ascii="Courier New" w:hAnsi="Courier New" w:cs="Courier New"/>
+          <w:sz w:val="19"/>
+        </w:rPr>
+      </w:pPr>
+      <w:r>
+        <w:rPr>
+          <w:rFonts w:ascii="Courier New" w:hAnsi="Courier New" w:cs="Courier New"/>
+          <w:sz w:val="19"/>
+        </w:rPr>
+        <w:t>};</w:t>
+      </w:r>
+    </w:p>
+    <w:p>
+      <w:pPr>
+        <w:spacing w:before="80" w:after="80" w:line="240" w:lineRule="auto"/>
+        <w:rPr>
+          <w:rFonts w:ascii="Courier New" w:hAnsi="Courier New" w:cs="Courier New"/>
+          <w:sz w:val="19"/>
+        </w:rPr>
+      </w:pPr>
+      <w:r>
+        <w:rPr>
+          <w:rFonts w:ascii="Courier New" w:hAnsi="Courier New" w:cs="Courier New"/>
+          <w:sz w:val="19"/>
+        </w:rPr>
+        <w:t>export const apiGetLichSuKhamBenh = async (maBN) =&gt; {</w:t>
+      </w:r>
+    </w:p>
+    <w:p>
+      <w:pPr>
+        <w:spacing w:before="80" w:after="80" w:line="240" w:lineRule="auto"/>
+        <w:rPr>
+          <w:rFonts w:ascii="Courier New" w:hAnsi="Courier New" w:cs="Courier New"/>
+          <w:sz w:val="19"/>
+        </w:rPr>
+      </w:pPr>
+      <w:r>
+        <w:rPr>
+          <w:rFonts w:ascii="Courier New" w:hAnsi="Courier New" w:cs="Courier New"/>
+          <w:sz w:val="19"/>
+        </w:rPr>
+        <w:t xml:space="preserve">  return await apiFetch(`/HoSoBenhAn/${maBN}/lich-su`);</w:t>
+      </w:r>
+    </w:p>
+    <w:p>
+      <w:pPr>
+        <w:spacing w:before="80" w:after="80" w:line="240" w:lineRule="auto"/>
+        <w:rPr>
+          <w:rFonts w:ascii="Courier New" w:hAnsi="Courier New" w:cs="Courier New"/>
+          <w:sz w:val="19"/>
+        </w:rPr>
+      </w:pPr>
+      <w:r>
+        <w:rPr>
+          <w:rFonts w:ascii="Courier New" w:hAnsi="Courier New" w:cs="Courier New"/>
+          <w:sz w:val="19"/>
+        </w:rPr>
+        <w:t>};</w:t>
       </w:r>
     </w:p>
     <w:p>
@@ -755,7 +1011,7 @@
           <w:b/>
           <w:sz w:val="26"/>
         </w:rPr>
-        <w:t>4.2. File giao dien HoSoBenhAn.jsx</w:t>
+        <w:t>4.2. Giao diện trang HoSoBenhAn.jsx</w:t>
       </w:r>
     </w:p>
     <w:p>
@@ -772,103 +1028,7 @@
           <w:rFonts w:ascii="Times New Roman" w:hAnsi="Times New Roman" w:cs="Times New Roman"/>
           <w:sz w:val="26"/>
         </w:rPr>
-        <w:t>Trang thuc hien:</w:t>
-      </w:r>
-    </w:p>
-    <w:p>
-      <w:pPr>
-        <w:spacing w:after="80" w:line="240" w:lineRule="auto"/>
-        <w:jc w:val="both"/>
-        <w:rPr>
-          <w:rFonts w:ascii="Times New Roman" w:hAnsi="Times New Roman" w:cs="Times New Roman"/>
-          <w:sz w:val="26"/>
-        </w:rPr>
-      </w:pPr>
-      <w:r>
-        <w:rPr>
-          <w:rFonts w:ascii="Times New Roman" w:hAnsi="Times New Roman" w:cs="Times New Roman"/>
-          <w:sz w:val="26"/>
-        </w:rPr>
-        <w:t xml:space="preserve">   *   </w:t>
-      </w:r>
-      <w:r>
-        <w:rPr>
-          <w:rFonts w:ascii="Times New Roman" w:hAnsi="Times New Roman" w:cs="Times New Roman"/>
-          <w:b/>
-          <w:sz w:val="26"/>
-        </w:rPr>
-        <w:t xml:space="preserve">Load list gan day: </w:t>
-      </w:r>
-      <w:r>
-        <w:rPr>
-          <w:rFonts w:ascii="Times New Roman" w:hAnsi="Times New Roman" w:cs="Times New Roman"/>
-          <w:sz w:val="26"/>
-        </w:rPr>
-        <w:t>Khai bao useEffect de khi mount trang se goi ngay apiGetBenhNhanGanDay de do vao cac bong bong goi y.</w:t>
-      </w:r>
-    </w:p>
-    <w:p>
-      <w:pPr>
-        <w:spacing w:after="80" w:line="240" w:lineRule="auto"/>
-        <w:jc w:val="both"/>
-        <w:rPr>
-          <w:rFonts w:ascii="Times New Roman" w:hAnsi="Times New Roman" w:cs="Times New Roman"/>
-          <w:sz w:val="26"/>
-        </w:rPr>
-      </w:pPr>
-      <w:r>
-        <w:rPr>
-          <w:rFonts w:ascii="Times New Roman" w:hAnsi="Times New Roman" w:cs="Times New Roman"/>
-          <w:sz w:val="26"/>
-        </w:rPr>
-        <w:t xml:space="preserve">   *   </w:t>
-      </w:r>
-      <w:r>
-        <w:rPr>
-          <w:rFonts w:ascii="Times New Roman" w:hAnsi="Times New Roman" w:cs="Times New Roman"/>
-          <w:b/>
-          <w:sz w:val="26"/>
-        </w:rPr>
-        <w:t xml:space="preserve">handleSearch: </w:t>
-      </w:r>
-      <w:r>
-        <w:rPr>
-          <w:rFonts w:ascii="Times New Roman" w:hAnsi="Times New Roman" w:cs="Times New Roman"/>
-          <w:sz w:val="26"/>
-        </w:rPr>
-        <w:t>Kich hoat khi go o tim kiem, goi apiTraCuuHoSoBenhAn truoc, neu thay se lay MaBN de goi tiep apiGetLichSuKhamBenh.</w:t>
-      </w:r>
-    </w:p>
-    <w:p>
-      <w:pPr>
-        <w:spacing w:after="80" w:line="240" w:lineRule="auto"/>
-        <w:jc w:val="both"/>
-        <w:rPr>
-          <w:rFonts w:ascii="Times New Roman" w:hAnsi="Times New Roman" w:cs="Times New Roman"/>
-          <w:sz w:val="26"/>
-        </w:rPr>
-      </w:pPr>
-      <w:r>
-        <w:rPr>
-          <w:rFonts w:ascii="Times New Roman" w:hAnsi="Times New Roman" w:cs="Times New Roman"/>
-          <w:sz w:val="26"/>
-        </w:rPr>
-        <w:t xml:space="preserve">   *   </w:t>
-      </w:r>
-      <w:r>
-        <w:rPr>
-          <w:rFonts w:ascii="Times New Roman" w:hAnsi="Times New Roman" w:cs="Times New Roman"/>
-          <w:b/>
-          <w:sz w:val="26"/>
-        </w:rPr>
-        <w:t xml:space="preserve">Lien ket Chi tiet: </w:t>
-      </w:r>
-      <w:r>
-        <w:rPr>
-          <w:rFonts w:ascii="Times New Roman" w:hAnsi="Times New Roman" w:cs="Times New Roman"/>
-          <w:sz w:val="26"/>
-        </w:rPr>
-        <w:t>Khi xem lich su neu click vao Ma phieu kham se navigate sang trang ho-so-chi-tiet/:maPhieu de xem toan bo sinh hieu, dich vu, don thuoc.</w:t>
+        <w:t>Sử dụng Hook useEffect để tự động gọi apiGetBenhNhanGanDay và hiển thị lối tắt chọn nhanh ở phía trên. Khi người dùng nhập từ khóa tìm kiếm và nhấn Enter, hàm handleSearch sẽ kích hoạt gọi apiTraCuuHoSoBenhAn để xác định bệnh nhân, sau đó gọi tiếp apiGetLichSuKhamBenh để hiển thị danh sách dạng timeline các lượt khám cũ kèm chẩn đoán y khoa.</w:t>
       </w:r>
     </w:p>
     <w:p>
@@ -886,7 +1046,7 @@
           <w:b/>
           <w:sz w:val="28"/>
         </w:rPr>
-        <w:t>5. CAC CAU HOI BAO VE LUAN VAN</w:t>
+        <w:t>5. CÁC CÂU HỎI THƯỜNG GẶP KHI BẢO VỆ LUẬN VĂN</w:t>
       </w:r>
     </w:p>
     <w:p>
@@ -904,7 +1064,7 @@
           <w:b/>
           <w:sz w:val="26"/>
         </w:rPr>
-        <w:t>Cau hoi 1: Giai thich thuat toan lay ra 5 benh nhan kham gan day nhat o Backend?</w:t>
+        <w:t>Câu hỏi 1: Giải thích thuật toán lấy danh sách 5 bệnh nhân khám gần đây nhất ở Backend?</w:t>
       </w:r>
     </w:p>
     <w:p>
@@ -921,7 +1081,7 @@
           <w:rFonts w:ascii="Times New Roman" w:hAnsi="Times New Roman" w:cs="Times New Roman"/>
           <w:sz w:val="26"/>
         </w:rPr>
-        <w:t>Tra loi: Backend thuc hien gom nhom GroupBy theo MaBN tren bang PhieuKham, dung phuong thuc group.Max(NgayKham) de xac dinh thoi gian luot tham kham gan nhat cua tung benh nhan. Sau do sap xep giam dan OrderByDescending va lay ra top 5 (Take(5)). Cuoi cung thuc hien JOIN voi bang BenhNhan de lay ra ten, tuoi, gioi tinh hien thi len giao dien.</w:t>
+        <w:t>Trả lời: Backend thực hiện gom nhóm (GroupBy) theo mã bệnh nhân (MaBn) trên bảng PhieuKham, dùng hàm Max(NgayKham) để xác định thời điểm khám gần nhất của từng bệnh nhân. Sau đó sắp xếp giảm dần theo thời gian khám cuối cùng đó, lấy ra top 5 (Take(5)) và JOIN ngược lại bảng BenhNhan để lấy thông tin hành chính hiển thị nhanh.</w:t>
       </w:r>
     </w:p>
     <w:p>
@@ -939,7 +1099,7 @@
           <w:b/>
           <w:sz w:val="26"/>
         </w:rPr>
-        <w:t>Cau hoi 2: Tai sao trong API lich su lai dung .AsNoTracking()?</w:t>
+        <w:t>Câu hỏi 2: Tại sao trong API lịch sử khám bệnh lại sử dụng `.AsNoTracking()`?</w:t>
       </w:r>
     </w:p>
     <w:p>
@@ -956,7 +1116,7 @@
           <w:rFonts w:ascii="Times New Roman" w:hAnsi="Times New Roman" w:cs="Times New Roman"/>
           <w:sz w:val="26"/>
         </w:rPr>
-        <w:t>Tra loi: Vi day la chuc nang tra cuu chi doc (Read-only), chung ta chi truy van du lieu lich su de hien thi chu khong co nhu cau chinh sua hay cap nhat lai thong tin cu do. Dung AsNoTracking() se yeu cau Entity Framework Core khong can luu tru cache theo doi thay doi (change tracking), giup tiet kiem dang ke tai nguyen RAM cua server va tang toc do phan hoi cua API.</w:t>
+        <w:t>Trả lời: Vì chức năng tra cứu lịch sử hồ sơ bệnh án là chức năng chỉ đọc (Read-only), hệ thống chỉ hiển thị thông tin cũ chứ không có nhu cầu sửa đổi các thực thể này. Sử dụng `.AsNoTracking()` yêu cầu Entity Framework Core bỏ qua việc lưu vết thay đổi trong bộ nhớ đệm (Change Tracker), giúp giảm tải RAM đáng kể cho server và tăng tốc độ xử lý câu lệnh truy vấn dữ liệu từ 20% đến 40%.</w:t>
       </w:r>
     </w:p>
     <w:p>
@@ -1387,7 +1547,7 @@
     <w:link w:val="Heading1Char"/>
     <w:uiPriority w:val="9"/>
     <w:qFormat/>
-    <w:rsid w:val="00B632A2"/>
+    <w:rsid w:val="00EA5301"/>
     <w:pPr>
       <w:keepNext/>
       <w:keepLines/>
@@ -1410,7 +1570,7 @@
     <w:semiHidden/>
     <w:unhideWhenUsed/>
     <w:qFormat/>
-    <w:rsid w:val="00B632A2"/>
+    <w:rsid w:val="00EA5301"/>
     <w:pPr>
       <w:keepNext/>
       <w:keepLines/>
@@ -1433,7 +1593,7 @@
     <w:semiHidden/>
     <w:unhideWhenUsed/>
     <w:qFormat/>
-    <w:rsid w:val="00B632A2"/>
+    <w:rsid w:val="00EA5301"/>
     <w:pPr>
       <w:keepNext/>
       <w:keepLines/>
@@ -1456,7 +1616,7 @@
     <w:semiHidden/>
     <w:unhideWhenUsed/>
     <w:qFormat/>
-    <w:rsid w:val="00B632A2"/>
+    <w:rsid w:val="00EA5301"/>
     <w:pPr>
       <w:keepNext/>
       <w:keepLines/>
@@ -1479,7 +1639,7 @@
     <w:semiHidden/>
     <w:unhideWhenUsed/>
     <w:qFormat/>
-    <w:rsid w:val="00B632A2"/>
+    <w:rsid w:val="00EA5301"/>
     <w:pPr>
       <w:keepNext/>
       <w:keepLines/>
@@ -1500,7 +1660,7 @@
     <w:semiHidden/>
     <w:unhideWhenUsed/>
     <w:qFormat/>
-    <w:rsid w:val="00B632A2"/>
+    <w:rsid w:val="00EA5301"/>
     <w:pPr>
       <w:keepNext/>
       <w:keepLines/>
@@ -1523,7 +1683,7 @@
     <w:semiHidden/>
     <w:unhideWhenUsed/>
     <w:qFormat/>
-    <w:rsid w:val="00B632A2"/>
+    <w:rsid w:val="00EA5301"/>
     <w:pPr>
       <w:keepNext/>
       <w:keepLines/>
@@ -1544,7 +1704,7 @@
     <w:semiHidden/>
     <w:unhideWhenUsed/>
     <w:qFormat/>
-    <w:rsid w:val="00B632A2"/>
+    <w:rsid w:val="00EA5301"/>
     <w:pPr>
       <w:keepNext/>
       <w:keepLines/>
@@ -1567,7 +1727,7 @@
     <w:semiHidden/>
     <w:unhideWhenUsed/>
     <w:qFormat/>
-    <w:rsid w:val="00B632A2"/>
+    <w:rsid w:val="00EA5301"/>
     <w:pPr>
       <w:keepNext/>
       <w:keepLines/>
@@ -1611,7 +1771,7 @@
     <w:basedOn w:val="DefaultParagraphFont"/>
     <w:link w:val="Heading1"/>
     <w:uiPriority w:val="9"/>
-    <w:rsid w:val="00B632A2"/>
+    <w:rsid w:val="00EA5301"/>
     <w:rPr>
       <w:rFonts w:asciiTheme="majorHAnsi" w:eastAsiaTheme="majorEastAsia" w:hAnsiTheme="majorHAnsi" w:cstheme="majorBidi"/>
       <w:color w:val="0F4761" w:themeColor="accent1" w:themeShade="BF"/>
@@ -1625,7 +1785,7 @@
     <w:link w:val="Heading2"/>
     <w:uiPriority w:val="9"/>
     <w:semiHidden/>
-    <w:rsid w:val="00B632A2"/>
+    <w:rsid w:val="00EA5301"/>
     <w:rPr>
       <w:rFonts w:asciiTheme="majorHAnsi" w:eastAsiaTheme="majorEastAsia" w:hAnsiTheme="majorHAnsi" w:cstheme="majorBidi"/>
       <w:color w:val="0F4761" w:themeColor="accent1" w:themeShade="BF"/>
@@ -1639,7 +1799,7 @@
     <w:link w:val="Heading3"/>
     <w:uiPriority w:val="9"/>
     <w:semiHidden/>
-    <w:rsid w:val="00B632A2"/>
+    <w:rsid w:val="00EA5301"/>
     <w:rPr>
       <w:rFonts w:eastAsiaTheme="majorEastAsia" w:cstheme="majorBidi"/>
       <w:color w:val="0F4761" w:themeColor="accent1" w:themeShade="BF"/>
@@ -1653,7 +1813,7 @@
     <w:link w:val="Heading4"/>
     <w:uiPriority w:val="9"/>
     <w:semiHidden/>
-    <w:rsid w:val="00B632A2"/>
+    <w:rsid w:val="00EA5301"/>
     <w:rPr>
       <w:rFonts w:eastAsiaTheme="majorEastAsia" w:cstheme="majorBidi"/>
       <w:i/>
@@ -1667,7 +1827,7 @@
     <w:link w:val="Heading5"/>
     <w:uiPriority w:val="9"/>
     <w:semiHidden/>
-    <w:rsid w:val="00B632A2"/>
+    <w:rsid w:val="00EA5301"/>
     <w:rPr>
       <w:rFonts w:eastAsiaTheme="majorEastAsia" w:cstheme="majorBidi"/>
       <w:color w:val="0F4761" w:themeColor="accent1" w:themeShade="BF"/>
@@ -1679,7 +1839,7 @@
     <w:link w:val="Heading6"/>
     <w:uiPriority w:val="9"/>
     <w:semiHidden/>
-    <w:rsid w:val="00B632A2"/>
+    <w:rsid w:val="00EA5301"/>
     <w:rPr>
       <w:rFonts w:eastAsiaTheme="majorEastAsia" w:cstheme="majorBidi"/>
       <w:i/>
@@ -1693,7 +1853,7 @@
     <w:link w:val="Heading7"/>
     <w:uiPriority w:val="9"/>
     <w:semiHidden/>
-    <w:rsid w:val="00B632A2"/>
+    <w:rsid w:val="00EA5301"/>
     <w:rPr>
       <w:rFonts w:eastAsiaTheme="majorEastAsia" w:cstheme="majorBidi"/>
       <w:color w:val="595959" w:themeColor="text1" w:themeTint="A6"/>
@@ -1705,7 +1865,7 @@
     <w:link w:val="Heading8"/>
     <w:uiPriority w:val="9"/>
     <w:semiHidden/>
-    <w:rsid w:val="00B632A2"/>
+    <w:rsid w:val="00EA5301"/>
     <w:rPr>
       <w:rFonts w:eastAsiaTheme="majorEastAsia" w:cstheme="majorBidi"/>
       <w:i/>
@@ -1719,7 +1879,7 @@
     <w:link w:val="Heading9"/>
     <w:uiPriority w:val="9"/>
     <w:semiHidden/>
-    <w:rsid w:val="00B632A2"/>
+    <w:rsid w:val="00EA5301"/>
     <w:rPr>
       <w:rFonts w:eastAsiaTheme="majorEastAsia" w:cstheme="majorBidi"/>
       <w:color w:val="272727" w:themeColor="text1" w:themeTint="D8"/>
@@ -1732,7 +1892,7 @@
     <w:link w:val="TitleChar"/>
     <w:uiPriority w:val="10"/>
     <w:qFormat/>
-    <w:rsid w:val="00B632A2"/>
+    <w:rsid w:val="00EA5301"/>
     <w:pPr>
       <w:spacing w:after="80" w:line="240" w:lineRule="auto"/>
       <w:contextualSpacing/>
@@ -1750,7 +1910,7 @@
     <w:basedOn w:val="DefaultParagraphFont"/>
     <w:link w:val="Title"/>
     <w:uiPriority w:val="10"/>
-    <w:rsid w:val="00B632A2"/>
+    <w:rsid w:val="00EA5301"/>
     <w:rPr>
       <w:rFonts w:asciiTheme="majorHAnsi" w:eastAsiaTheme="majorEastAsia" w:hAnsiTheme="majorHAnsi" w:cstheme="majorBidi"/>
       <w:spacing w:val="-10"/>
@@ -1766,7 +1926,7 @@
     <w:link w:val="SubtitleChar"/>
     <w:uiPriority w:val="11"/>
     <w:qFormat/>
-    <w:rsid w:val="00B632A2"/>
+    <w:rsid w:val="00EA5301"/>
     <w:pPr>
       <w:numPr>
         <w:ilvl w:val="1"/>
@@ -1785,7 +1945,7 @@
     <w:basedOn w:val="DefaultParagraphFont"/>
     <w:link w:val="Subtitle"/>
     <w:uiPriority w:val="11"/>
-    <w:rsid w:val="00B632A2"/>
+    <w:rsid w:val="00EA5301"/>
     <w:rPr>
       <w:rFonts w:eastAsiaTheme="majorEastAsia" w:cstheme="majorBidi"/>
       <w:color w:val="595959" w:themeColor="text1" w:themeTint="A6"/>
@@ -1801,7 +1961,7 @@
     <w:link w:val="QuoteChar"/>
     <w:uiPriority w:val="29"/>
     <w:qFormat/>
-    <w:rsid w:val="00B632A2"/>
+    <w:rsid w:val="00EA5301"/>
     <w:pPr>
       <w:spacing w:before="160"/>
       <w:jc w:val="center"/>
@@ -1817,7 +1977,7 @@
     <w:basedOn w:val="DefaultParagraphFont"/>
     <w:link w:val="Quote"/>
     <w:uiPriority w:val="29"/>
-    <w:rsid w:val="00B632A2"/>
+    <w:rsid w:val="00EA5301"/>
     <w:rPr>
       <w:i/>
       <w:iCs/>
@@ -1829,7 +1989,7 @@
     <w:basedOn w:val="Normal"/>
     <w:uiPriority w:val="34"/>
     <w:qFormat/>
-    <w:rsid w:val="00B632A2"/>
+    <w:rsid w:val="00EA5301"/>
     <w:pPr>
       <w:ind w:left="720"/>
       <w:contextualSpacing/>
@@ -1840,7 +2000,7 @@
     <w:basedOn w:val="DefaultParagraphFont"/>
     <w:uiPriority w:val="21"/>
     <w:qFormat/>
-    <w:rsid w:val="00B632A2"/>
+    <w:rsid w:val="00EA5301"/>
     <w:rPr>
       <w:i/>
       <w:iCs/>
@@ -1854,7 +2014,7 @@
     <w:link w:val="IntenseQuoteChar"/>
     <w:uiPriority w:val="30"/>
     <w:qFormat/>
-    <w:rsid w:val="00B632A2"/>
+    <w:rsid w:val="00EA5301"/>
     <w:pPr>
       <w:pBdr>
         <w:top w:val="single" w:sz="4" w:space="10" w:color="0F4761" w:themeColor="accent1" w:themeShade="BF"/>
@@ -1875,7 +2035,7 @@
     <w:basedOn w:val="DefaultParagraphFont"/>
     <w:link w:val="IntenseQuote"/>
     <w:uiPriority w:val="30"/>
-    <w:rsid w:val="00B632A2"/>
+    <w:rsid w:val="00EA5301"/>
     <w:rPr>
       <w:i/>
       <w:iCs/>
@@ -1887,7 +2047,7 @@
     <w:basedOn w:val="DefaultParagraphFont"/>
     <w:uiPriority w:val="32"/>
     <w:qFormat/>
-    <w:rsid w:val="00B632A2"/>
+    <w:rsid w:val="00EA5301"/>
     <w:rPr>
       <w:b/>
       <w:bCs/>

</xml_diff>